<commit_message>
El formulario de conflicto de interés no nombra a los auspiciantes
Decisión de la Dra. Omidres. Se revierte el párrafo añadido el 30/09 a
SEDA_Declaracion_Conflicto_Interes.docx: el formulario vuelve a pedir los
vínculos de los últimos 24 meses sin acotar con quién. Como la Dra.
Álvarez conserva la versión original, ya no hay que reenviarle nada.

Los auspiciantes permanecen en el expediente, donde la Comisión pidió
declarar expresamente la entidad auspiciante, y en la declaración propia
de la coordinadora como constancia de que no tiene vínculo con ellos.

Co-Authored-By: Claude Opus 5 <noreply@anthropic.com>
Claude-Session: https://claude.ai/code/session_019GZ8Kkm9KwxHQZEVf8yg4N
</commit_message>
<xml_diff>
--- a/curso-obesidad-seda/SEDA_COI_Omidres_Perez_prellenada.docx
+++ b/curso-obesidad-seda/SEDA_COI_Omidres_Perez_prellenada.docx
@@ -829,20 +829,6 @@
     </w:p>
     <w:p>
       <w:pPr>
-        <w:spacing w:after="120"/>
-      </w:pPr>
-      <w:r>
-        <w:rPr>
-          <w:b w:val="0"/>
-          <w:i/>
-          <w:color w:val="6B6B6B"/>
-          <w:sz w:val="16"/>
-        </w:rPr>
-        <w:t>Auspiciantes declarados de este curso: Boehringer Ingelheim, Laboratorios Elea y Laboratorio Saval. Si usted mantiene o mantuvo vínculos con alguno de ellos en los últimos 24 meses, declárelos expresamente en el cuadro anterior. Los auspiciantes no intervienen en la selección de docentes, temas ni contenidos del curso.</w:t>
-      </w:r>
-    </w:p>
-    <w:p>
-      <w:pPr>
         <w:spacing w:before="280" w:after="120"/>
       </w:pPr>
       <w:r>

</xml_diff>

<commit_message>
Styp Canto acepta M7 · C4; la Dra. Omidres conserva M7 · C1
- Matriz: M7 · C4 asignada y fila nueva en Ponentes (datos POR CONFIRMAR)
- Declaración COI de la Dra. Omidres: se quita M7 · C4
- Registro del vínculo MEDDI en conflictos-de-interes-expediente.md
- Directorio regenerado (23 docentes) y delimitación actualizada

Co-Authored-By: Claude Opus 5.5 <noreply@anthropic.com>
Claude-Session: https://claude.ai/code/session_012B5UyXLL9ubxzuQGBWyzbg
</commit_message>
<xml_diff>
--- a/curso-obesidad-seda/SEDA_COI_Omidres_Perez_prellenada.docx
+++ b/curso-obesidad-seda/SEDA_COI_Omidres_Perez_prellenada.docx
@@ -388,47 +388,6 @@
           </w:p>
         </w:tc>
       </w:tr>
-      <w:tr>
-        <w:tc>
-          <w:tcPr>
-            <w:tcW w:type="dxa" w:w="3249"/>
-          </w:tcPr>
-          <w:p>
-            <w:r>
-              <w:rPr>
-                <w:b w:val="0"/>
-              </w:rPr>
-              <w:t>M7 · C4</w:t>
-            </w:r>
-          </w:p>
-        </w:tc>
-        <w:tc>
-          <w:tcPr>
-            <w:tcW w:type="dxa" w:w="3249"/>
-          </w:tcPr>
-          <w:p>
-            <w:r>
-              <w:rPr>
-                <w:b w:val="0"/>
-              </w:rPr>
-              <w:t>Implementación, ética y seguridad de datos</w:t>
-            </w:r>
-          </w:p>
-        </w:tc>
-        <w:tc>
-          <w:tcPr>
-            <w:tcW w:type="dxa" w:w="3249"/>
-          </w:tcPr>
-          <w:p>
-            <w:r>
-              <w:rPr>
-                <w:b w:val="0"/>
-              </w:rPr>
-              <w:t>jueves 3 de diciembre de 2026</w:t>
-            </w:r>
-          </w:p>
-        </w:tc>
-      </w:tr>
     </w:tbl>
     <w:p>
       <w:pPr>
@@ -747,7 +706,7 @@
           </w:tcPr>
           <w:p>
             <w:r>
-              <w:t>Se declara por transparencia, no por relación con el contenido. MEDDI Hub no auspicia este curso, no interviene en él y no remunera a la declarante por su participación. El contenido de M7·C1 y M7·C4 procede de su obra publicada y de su experiencia clínica y docente, no de esta vinculación. No se nombrará ninguna plataforma ni marca comercial durante las clases.</w:t>
+              <w:t>Se declara por transparencia, no por relación con el contenido. MEDDI Hub no auspicia este curso, no interviene en él y no remunera a la declarante por su participación. El contenido de M7·C1 procede de su obra publicada y de su experiencia clínica y docente, no de esta vinculación. No se nombrará ninguna plataforma ni marca comercial durante las clases.</w:t>
             </w:r>
           </w:p>
         </w:tc>

</xml_diff>

<commit_message>
M3 · C2 pasa a la Dra. Omidres; expediente completo (24 docentes), declaración y conflictos actualizados
Co-Authored-By: Claude Opus 5.5 <noreply@anthropic.com>
Claude-Session: https://claude.ai/code/session_012B5UyXLL9ubxzuQGBWyzbg
</commit_message>
<xml_diff>
--- a/curso-obesidad-seda/SEDA_COI_Omidres_Perez_prellenada.docx
+++ b/curso-obesidad-seda/SEDA_COI_Omidres_Perez_prellenada.docx
@@ -343,6 +343,47 @@
                 <w:sz w:val="18"/>
               </w:rPr>
               <w:t>Fecha de entrega de la grabación</w:t>
+            </w:r>
+          </w:p>
+        </w:tc>
+      </w:tr>
+      <w:tr>
+        <w:tc>
+          <w:tcPr>
+            <w:tcW w:type="dxa" w:w="3249"/>
+          </w:tcPr>
+          <w:p>
+            <w:r>
+              <w:rPr>
+                <w:b w:val="0"/>
+              </w:rPr>
+              <w:t>M3 · C2</w:t>
+            </w:r>
+          </w:p>
+        </w:tc>
+        <w:tc>
+          <w:tcPr>
+            <w:tcW w:type="dxa" w:w="3249"/>
+          </w:tcPr>
+          <w:p>
+            <w:r>
+              <w:rPr>
+                <w:b w:val="0"/>
+              </w:rPr>
+              <w:t>Agonistas del receptor de GLP-1</w:t>
+            </w:r>
+          </w:p>
+        </w:tc>
+        <w:tc>
+          <w:tcPr>
+            <w:tcW w:type="dxa" w:w="3249"/>
+          </w:tcPr>
+          <w:p>
+            <w:r>
+              <w:rPr>
+                <w:b w:val="0"/>
+              </w:rPr>
+              <w:t>jueves 5 de noviembre de 2026</w:t>
             </w:r>
           </w:p>
         </w:tc>
@@ -706,7 +747,7 @@
           </w:tcPr>
           <w:p>
             <w:r>
-              <w:t>Se declara por transparencia, no por relación con el contenido. MEDDI Hub no auspicia este curso, no interviene en él y no remunera a la declarante por su participación. El contenido de M7·C1 procede de su obra publicada y de su experiencia clínica y docente, no de esta vinculación. No se nombrará ninguna plataforma ni marca comercial durante las clases.</w:t>
+              <w:t>Se declara por transparencia, no por relación con el contenido. MEDDI Hub no auspicia este curso, no interviene en él y no remunera a la declarante por su participación. El contenido de sus clases (M3·C2 y M7·C1) procede de la evidencia científica publicada y de su experiencia clínica y docente, no de esta vinculación. No se nombrará ninguna plataforma ni marca comercial durante las clases.</w:t>
             </w:r>
           </w:p>
         </w:tc>

</xml_diff>